<commit_message>
feat(projects): add GenixDrive case study
Add AiGenix's GenixDrive 3.0 connected-car telematics app as project
#23, placed second in the hub after PerkMap so the Data Science lead
card keeps the first impression.

- New portfolio entry with case study, four result tiles, and composited
  phone screenshots (header badge, test promo, and personal trip strip
  cropped out)
- AiGenix experience expanded to five bullets covering both PerkMap and
  GenixDrive; skills gain Flutter, Dart, Socket.IO, Firebase
- Landing bio and sitemap updated; resume PDF (2 pages) and DOCX
  regenerated from the updated sources

Co-Authored-By: Claude Fable 5.1 <noreply@anthropic.com>
</commit_message>
<xml_diff>
--- a/public/resume/Usama_Bin_Ejaz_Resume.docx
+++ b/public/resume/Usama_Bin_Ejaz_Resume.docx
@@ -127,7 +127,7 @@
           <w:sz w:val="21"/>
           <w:u w:val="none"/>
         </w:rPr>
-        <w:t>AI/ML Engineer with 4+ years building production-grade machine learning systems, LLM applications, and scalable data infrastructure across e-commerce, fintech, logistics, healthcare, and property-valuation domains. Measurable impact: 85% LLM extraction accuracy, 18% fraud reduction, 20% forecasting improvement, and 30% customer-engagement lift. End-to-end ownership from data pipelines through model deployment to full-stack delivery. MS in AI &amp; Data Science (Germany); fluent in English (IELTS C1).</w:t>
+        <w:t>AI/ML Engineer with 4+ years building production-grade machine learning systems, LLM applications, and scalable data infrastructure across e-commerce, fintech, logistics, telematics, healthcare, and property-valuation domains. Measurable impact: 85% LLM extraction accuracy, 18% fraud reduction, 20% forecasting improvement, and 30% customer-engagement lift. End-to-end ownership from data pipelines through model deployment to full-stack delivery. MS in AI &amp; Data Science (Germany); fluent in English (IELTS C1).</w:t>
       </w:r>
     </w:p>
     <w:p>
@@ -270,7 +270,7 @@
           <w:sz w:val="21"/>
           <w:u w:val="none"/>
         </w:rPr>
-        <w:t>Python, SQL, TypeScript, JavaScript, C++, C#</w:t>
+        <w:t>Python, SQL, TypeScript, JavaScript, Dart, C++, C#</w:t>
       </w:r>
     </w:p>
     <w:p>
@@ -295,7 +295,7 @@
           <w:sz w:val="21"/>
           <w:u w:val="none"/>
         </w:rPr>
-        <w:t>FastAPI, Flask, Next.js, React, React Native, Electron; AWS, GCP, Azure; PostgreSQL, MySQL, MongoDB; Docker, Git, GitHub Actions, Render, Vercel; Power BI, Tableau</w:t>
+        <w:t>FastAPI, Flask, Next.js, React, React Native, Flutter, Socket.IO, Electron; AWS, GCP, Azure; PostgreSQL, MySQL, MongoDB, Firebase; Docker, Git, GitHub Actions, Render, Vercel; Power BI, Tableau</w:t>
       </w:r>
     </w:p>
     <w:p>
@@ -427,7 +427,7 @@
           <w:sz w:val="21"/>
           <w:u w:val="none"/>
         </w:rPr>
-        <w:t>Built merchant analytics: audience</w:t>
+        <w:t>Rebuilt the driver-analytics dashboards of GenixDrive</w:t>
       </w:r>
       <w:r>
         <w:rPr>
@@ -437,7 +437,7 @@
           <w:sz w:val="21"/>
           <w:u w:val="none"/>
         </w:rPr>
-        <w:t xml:space="preserve"> dashboards and a privacy-preserving geospatial activity heatmap with consent gating and small-cohort suppression (no counts below 3 users).</w:t>
+        <w:t>, a connected-car telematics app (Android and iOS), and specified their API contracts: drive-score comparisons with other drivers by country, region and city, distance-bucket histograms, driving-time distributions and driving-event breakdowns.</w:t>
       </w:r>
     </w:p>
     <w:p>
@@ -453,7 +453,7 @@
           <w:sz w:val="21"/>
           <w:u w:val="none"/>
         </w:rPr>
-        <w:t>Shipped the delivery surfaces</w:t>
+        <w:t>Built PerkMap merchant analytics</w:t>
       </w:r>
       <w:r>
         <w:rPr>
@@ -463,7 +463,33 @@
           <w:sz w:val="21"/>
           <w:u w:val="none"/>
         </w:rPr>
-        <w:t xml:space="preserve"> end to end: a 5-city consumer app (Expo/React Native, live on Google Play and the App Store) and a bilingual (EN/AR) merchant portal on a Supabase/Postgres API with JWT + Row-Level Security.</w:t>
+        <w:t>, including a privacy-preserving geospatial heatmap with consent gating and small-cohort suppression, and shipped its delivery surfaces: a 5-city consumer app live on Google Play and the App Store, and a bilingual (EN/AR) merchant portal on a Supabase/Postgres API with JWT and Row-Level Security.</w:t>
+      </w:r>
+    </w:p>
+    <w:p>
+      <w:pPr>
+        <w:pStyle w:val="ListBullet"/>
+        <w:spacing w:before="0" w:after="20" w:line="240" w:lineRule="auto"/>
+      </w:pPr>
+      <w:r>
+        <w:rPr>
+          <w:rFonts w:ascii="Calibri" w:hAnsi="Calibri" w:cs="Calibri"/>
+          <w:b/>
+          <w:i w:val="0"/>
+          <w:sz w:val="21"/>
+          <w:u w:val="none"/>
+        </w:rPr>
+        <w:t>Led the Flutter rebuild</w:t>
+      </w:r>
+      <w:r>
+        <w:rPr>
+          <w:rFonts w:ascii="Calibri" w:hAnsi="Calibri" w:cs="Calibri"/>
+          <w:b w:val="0"/>
+          <w:i w:val="0"/>
+          <w:sz w:val="21"/>
+          <w:u w:val="none"/>
+        </w:rPr>
+        <w:t xml:space="preserve"> of the GenixDrive app for its 3.0 release, authoring over 80% of the changes: consent-scoped live-location and trip sharing, group drives with live ETAs over Socket.IO and Google Maps, a push-notification router for ~90 event types, 480+ automated tests and a Codemagic-to-TestFlight pipeline, against a NestJS/PostGIS backend on AWS.</w:t>
       </w:r>
     </w:p>
     <w:p>
@@ -1217,7 +1243,7 @@
           <w:sz w:val="21"/>
           <w:u w:val="none"/>
         </w:rPr>
-        <w:t>RAG-Powered Document Q&amp;A</w:t>
+        <w:t>GenixDrive - Connected-Car Telematics App</w:t>
       </w:r>
       <w:r>
         <w:tab/>
@@ -1230,7 +1256,7 @@
           <w:sz w:val="21"/>
           <w:u w:val="none"/>
         </w:rPr>
-        <w:t>Generative AI / LLM</w:t>
+        <w:t>Mobile / Full-Stack</w:t>
       </w:r>
     </w:p>
     <w:p>
@@ -1245,7 +1271,7 @@
           <w:sz w:val="21"/>
           <w:u w:val="none"/>
         </w:rPr>
-        <w:t>Conversational Q&amp;A over 10K+ documents using a Pinecone vector pipeline with source attribution and multi-tenant namespace isolation.</w:t>
+        <w:t>Led the 3.0 rebuild of AiGenix's connected-car telematics app in Flutter (91 screens, 480+ tests): drive-score dashboards with comparisons by country, region and city, distance-bucket histograms, consent-scoped live-location sharing and group drives with live ETAs; NestJS/PostGIS backend on AWS.</w:t>
       </w:r>
     </w:p>
     <w:p>

</xml_diff>

<commit_message>
fix(content): name AWS Lightsail as GenixDrive backend host
Make the GenixDrive copy specific now that the hosting service is
confirmed, and ship the regenerated resume PDF and DOCX.

Co-Authored-By: Claude Fable 5.1 <noreply@anthropic.com>
</commit_message>
<xml_diff>
--- a/public/resume/Usama_Bin_Ejaz_Resume.docx
+++ b/public/resume/Usama_Bin_Ejaz_Resume.docx
@@ -489,7 +489,7 @@
           <w:sz w:val="21"/>
           <w:u w:val="none"/>
         </w:rPr>
-        <w:t xml:space="preserve"> of the GenixDrive app for its 3.0 release, authoring over 80% of the changes: consent-scoped live-location and trip sharing, group drives with live ETAs over Socket.IO and Google Maps, a push-notification router for ~90 event types, 480+ automated tests and a Codemagic-to-TestFlight pipeline, against a NestJS/PostGIS backend on AWS.</w:t>
+        <w:t xml:space="preserve"> of the GenixDrive app for its 3.0 release, authoring over 80% of the changes: consent-scoped live-location and trip sharing, group drives with live ETAs over Socket.IO and Google Maps, a push-notification router for ~90 event types, 480+ automated tests and a Codemagic-to-TestFlight pipeline, against a NestJS/PostGIS backend on AWS Lightsail.</w:t>
       </w:r>
     </w:p>
     <w:p>
@@ -1271,7 +1271,7 @@
           <w:sz w:val="21"/>
           <w:u w:val="none"/>
         </w:rPr>
-        <w:t>Led the 3.0 rebuild of AiGenix's connected-car telematics app in Flutter (91 screens, 480+ tests): drive-score dashboards with comparisons by country, region and city, distance-bucket histograms, consent-scoped live-location sharing and group drives with live ETAs; NestJS/PostGIS backend on AWS.</w:t>
+        <w:t>Led the 3.0 rebuild of AiGenix's connected-car telematics app in Flutter (91 screens, 480+ tests): drive-score dashboards with comparisons by country, region and city, distance-bucket histograms, consent-scoped live-location sharing and group drives with live ETAs; NestJS/PostGIS backend on AWS Lightsail.</w:t>
       </w:r>
     </w:p>
     <w:p>

</xml_diff>